<commit_message>
Expand Ask OUG copy review with sidebar, topics, and auth flows.
Document Discussion/Tags sidebar, demo topic rows, topic detail, signup, and verification copy for expert review.

Co-authored-by: Cursor <cursoragent@cursor.com>
</commit_message>
<xml_diff>
--- a/docs/copy-review/ODA-Demo-Copy-Review.docx
+++ b/docs/copy-review/ODA-Demo-Copy-Review.docx
@@ -3606,7 +3606,7 @@
         <w:pStyle w:val="Heading2"/>
       </w:pPr>
       <w:r>
-        <w:t>H. Ask OUG</w:t>
+        <w:t>H. Ask OUG — Sidebar &amp; Topics</w:t>
       </w:r>
     </w:p>
     <w:p>
@@ -3705,37 +3705,37 @@
           </w:tcPr>
           <w:p>
             <w:r>
-              <w:t>Q-01</w:t>
-            </w:r>
-          </w:p>
-        </w:tc>
-        <w:tc>
-          <w:tcPr>
-            <w:tcW w:type="dxa" w:w="1728"/>
-          </w:tcPr>
-          <w:p>
-            <w:r>
-              <w:t>Banner</w:t>
-            </w:r>
-          </w:p>
-        </w:tc>
-        <w:tc>
-          <w:tcPr>
-            <w:tcW w:type="dxa" w:w="1728"/>
-          </w:tcPr>
-          <w:p>
-            <w:r>
-              <w:t>M1 · On-site Q&amp;A demo · Browse topics below; posting opens after legal review</w:t>
-            </w:r>
-          </w:p>
-        </w:tc>
-        <w:tc>
-          <w:tcPr>
-            <w:tcW w:type="dxa" w:w="1728"/>
-          </w:tcPr>
-          <w:p>
-            <w:r>
-              <w:t>顶栏</w:t>
+              <w:t>Q-SB-01</w:t>
+            </w:r>
+          </w:p>
+        </w:tc>
+        <w:tc>
+          <w:tcPr>
+            <w:tcW w:type="dxa" w:w="1728"/>
+          </w:tcPr>
+          <w:p>
+            <w:r>
+              <w:t>Sidebar</w:t>
+            </w:r>
+          </w:p>
+        </w:tc>
+        <w:tc>
+          <w:tcPr>
+            <w:tcW w:type="dxa" w:w="1728"/>
+          </w:tcPr>
+          <w:p>
+            <w:r>
+              <w:t>Discussion</w:t>
+            </w:r>
+          </w:p>
+        </w:tc>
+        <w:tc>
+          <w:tcPr>
+            <w:tcW w:type="dxa" w:w="1728"/>
+          </w:tcPr>
+          <w:p>
+            <w:r>
+              <w:t>导航标题</w:t>
             </w:r>
           </w:p>
         </w:tc>
@@ -3755,37 +3755,37 @@
           </w:tcPr>
           <w:p>
             <w:r>
-              <w:t>Q-03</w:t>
-            </w:r>
-          </w:p>
-        </w:tc>
-        <w:tc>
-          <w:tcPr>
-            <w:tcW w:type="dxa" w:w="1728"/>
-          </w:tcPr>
-          <w:p>
-            <w:r>
-              <w:t>H1</w:t>
-            </w:r>
-          </w:p>
-        </w:tc>
-        <w:tc>
-          <w:tcPr>
-            <w:tcW w:type="dxa" w:w="1728"/>
-          </w:tcPr>
-          <w:p>
-            <w:r>
-              <w:t>OceanBase User Group Q&amp;A</w:t>
-            </w:r>
-          </w:p>
-        </w:tc>
-        <w:tc>
-          <w:tcPr>
-            <w:tcW w:type="dxa" w:w="1728"/>
-          </w:tcPr>
-          <w:p>
-            <w:r>
-              <w:t>标题</w:t>
+              <w:t>Q-SB-02</w:t>
+            </w:r>
+          </w:p>
+        </w:tc>
+        <w:tc>
+          <w:tcPr>
+            <w:tcW w:type="dxa" w:w="1728"/>
+          </w:tcPr>
+          <w:p>
+            <w:r>
+              <w:t>Sidebar</w:t>
+            </w:r>
+          </w:p>
+        </w:tc>
+        <w:tc>
+          <w:tcPr>
+            <w:tcW w:type="dxa" w:w="1728"/>
+          </w:tcPr>
+          <w:p>
+            <w:r>
+              <w:t>Ask OUG</w:t>
+            </w:r>
+          </w:p>
+        </w:tc>
+        <w:tc>
+          <w:tcPr>
+            <w:tcW w:type="dxa" w:w="1728"/>
+          </w:tcPr>
+          <w:p>
+            <w:r>
+              <w:t>导航项</w:t>
             </w:r>
           </w:p>
         </w:tc>
@@ -3805,37 +3805,37 @@
           </w:tcPr>
           <w:p>
             <w:r>
-              <w:t>Q-04</w:t>
-            </w:r>
-          </w:p>
-        </w:tc>
-        <w:tc>
-          <w:tcPr>
-            <w:tcW w:type="dxa" w:w="1728"/>
-          </w:tcPr>
-          <w:p>
-            <w:r>
-              <w:t>描述</w:t>
-            </w:r>
-          </w:p>
-        </w:tc>
-        <w:tc>
-          <w:tcPr>
-            <w:tcW w:type="dxa" w:w="1728"/>
-          </w:tcPr>
-          <w:p>
-            <w:r>
-              <w:t>Your go-to space for troubleshooting and how-to help on OceanBase, seekdb, and production deployments.</w:t>
-            </w:r>
-          </w:p>
-        </w:tc>
-        <w:tc>
-          <w:tcPr>
-            <w:tcW w:type="dxa" w:w="1728"/>
-          </w:tcPr>
-          <w:p>
-            <w:r>
-              <w:t>正文</w:t>
+              <w:t>Q-SB-03</w:t>
+            </w:r>
+          </w:p>
+        </w:tc>
+        <w:tc>
+          <w:tcPr>
+            <w:tcW w:type="dxa" w:w="1728"/>
+          </w:tcPr>
+          <w:p>
+            <w:r>
+              <w:t>Sidebar</w:t>
+            </w:r>
+          </w:p>
+        </w:tc>
+        <w:tc>
+          <w:tcPr>
+            <w:tcW w:type="dxa" w:w="1728"/>
+          </w:tcPr>
+          <w:p>
+            <w:r>
+              <w:t>Tags</w:t>
+            </w:r>
+          </w:p>
+        </w:tc>
+        <w:tc>
+          <w:tcPr>
+            <w:tcW w:type="dxa" w:w="1728"/>
+          </w:tcPr>
+          <w:p>
+            <w:r>
+              <w:t>标签区标题</w:t>
             </w:r>
           </w:p>
         </w:tc>
@@ -3855,37 +3855,37 @@
           </w:tcPr>
           <w:p>
             <w:r>
-              <w:t>Q-08</w:t>
-            </w:r>
-          </w:p>
-        </w:tc>
-        <w:tc>
-          <w:tcPr>
-            <w:tcW w:type="dxa" w:w="1728"/>
-          </w:tcPr>
-          <w:p>
-            <w:r>
-              <w:t>注册</w:t>
-            </w:r>
-          </w:p>
-        </w:tc>
-        <w:tc>
-          <w:tcPr>
-            <w:tcW w:type="dxa" w:w="1728"/>
-          </w:tcPr>
-          <w:p>
-            <w:r>
-              <w:t>Sign up for Ask OUG</w:t>
-            </w:r>
-          </w:p>
-        </w:tc>
-        <w:tc>
-          <w:tcPr>
-            <w:tcW w:type="dxa" w:w="1728"/>
-          </w:tcPr>
-          <w:p>
-            <w:r>
-              <w:t>标题</w:t>
+              <w:t>Q-SB-04</w:t>
+            </w:r>
+          </w:p>
+        </w:tc>
+        <w:tc>
+          <w:tcPr>
+            <w:tcW w:type="dxa" w:w="1728"/>
+          </w:tcPr>
+          <w:p>
+            <w:r>
+              <w:t>Sidebar Tag</w:t>
+            </w:r>
+          </w:p>
+        </w:tc>
+        <w:tc>
+          <w:tcPr>
+            <w:tcW w:type="dxa" w:w="1728"/>
+          </w:tcPr>
+          <w:p>
+            <w:r>
+              <w:t>seekdb</w:t>
+            </w:r>
+          </w:p>
+        </w:tc>
+        <w:tc>
+          <w:tcPr>
+            <w:tcW w:type="dxa" w:w="1728"/>
+          </w:tcPr>
+          <w:p>
+            <w:r>
+              <w:t>标签</w:t>
             </w:r>
           </w:p>
         </w:tc>
@@ -3905,37 +3905,37 @@
           </w:tcPr>
           <w:p>
             <w:r>
-              <w:t>Q-14</w:t>
-            </w:r>
-          </w:p>
-        </w:tc>
-        <w:tc>
-          <w:tcPr>
-            <w:tcW w:type="dxa" w:w="1728"/>
-          </w:tcPr>
-          <w:p>
-            <w:r>
-              <w:t>验证</w:t>
-            </w:r>
-          </w:p>
-        </w:tc>
-        <w:tc>
-          <w:tcPr>
-            <w:tcW w:type="dxa" w:w="1728"/>
-          </w:tcPr>
-          <w:p>
-            <w:r>
-              <w:t>Check your email — Verify email from The OceanData4AI Community</w:t>
-            </w:r>
-          </w:p>
-        </w:tc>
-        <w:tc>
-          <w:tcPr>
-            <w:tcW w:type="dxa" w:w="1728"/>
-          </w:tcPr>
-          <w:p>
-            <w:r>
-              <w:t>邮件流</w:t>
+              <w:t>Q-SB-05</w:t>
+            </w:r>
+          </w:p>
+        </w:tc>
+        <w:tc>
+          <w:tcPr>
+            <w:tcW w:type="dxa" w:w="1728"/>
+          </w:tcPr>
+          <w:p>
+            <w:r>
+              <w:t>Sidebar Tag</w:t>
+            </w:r>
+          </w:p>
+        </w:tc>
+        <w:tc>
+          <w:tcPr>
+            <w:tcW w:type="dxa" w:w="1728"/>
+          </w:tcPr>
+          <w:p>
+            <w:r>
+              <w:t>deployment</w:t>
+            </w:r>
+          </w:p>
+        </w:tc>
+        <w:tc>
+          <w:tcPr>
+            <w:tcW w:type="dxa" w:w="1728"/>
+          </w:tcPr>
+          <w:p>
+            <w:r>
+              <w:t>标签</w:t>
             </w:r>
           </w:p>
         </w:tc>
@@ -3955,37 +3955,686 @@
           </w:tcPr>
           <w:p>
             <w:r>
-              <w:t>Q-15</w:t>
-            </w:r>
-          </w:p>
-        </w:tc>
-        <w:tc>
-          <w:tcPr>
-            <w:tcW w:type="dxa" w:w="1728"/>
-          </w:tcPr>
-          <w:p>
-            <w:r>
-              <w:t>发帖</w:t>
-            </w:r>
-          </w:p>
-        </w:tc>
-        <w:tc>
-          <w:tcPr>
-            <w:tcW w:type="dxa" w:w="1728"/>
-          </w:tcPr>
-          <w:p>
-            <w:r>
-              <w:t>Start a discussion — Ask the OceanBase User Group community.</w:t>
-            </w:r>
-          </w:p>
-        </w:tc>
-        <w:tc>
-          <w:tcPr>
-            <w:tcW w:type="dxa" w:w="1728"/>
-          </w:tcPr>
-          <w:p>
-            <w:r>
-              <w:t>正文</w:t>
+              <w:t>Q-SB-06</w:t>
+            </w:r>
+          </w:p>
+        </w:tc>
+        <w:tc>
+          <w:tcPr>
+            <w:tcW w:type="dxa" w:w="1728"/>
+          </w:tcPr>
+          <w:p>
+            <w:r>
+              <w:t>Sidebar Tag</w:t>
+            </w:r>
+          </w:p>
+        </w:tc>
+        <w:tc>
+          <w:tcPr>
+            <w:tcW w:type="dxa" w:w="1728"/>
+          </w:tcPr>
+          <w:p>
+            <w:r>
+              <w:t>vector</w:t>
+            </w:r>
+          </w:p>
+        </w:tc>
+        <w:tc>
+          <w:tcPr>
+            <w:tcW w:type="dxa" w:w="1728"/>
+          </w:tcPr>
+          <w:p>
+            <w:r>
+              <w:t>标签</w:t>
+            </w:r>
+          </w:p>
+        </w:tc>
+        <w:tc>
+          <w:tcPr>
+            <w:tcW w:type="dxa" w:w="1728"/>
+          </w:tcPr>
+          <w:p>
+            <w:r/>
+          </w:p>
+        </w:tc>
+      </w:tr>
+      <w:tr>
+        <w:tc>
+          <w:tcPr>
+            <w:tcW w:type="dxa" w:w="1728"/>
+          </w:tcPr>
+          <w:p>
+            <w:r>
+              <w:t>Q-SB-07</w:t>
+            </w:r>
+          </w:p>
+        </w:tc>
+        <w:tc>
+          <w:tcPr>
+            <w:tcW w:type="dxa" w:w="1728"/>
+          </w:tcPr>
+          <w:p>
+            <w:r>
+              <w:t>Sidebar Tag</w:t>
+            </w:r>
+          </w:p>
+        </w:tc>
+        <w:tc>
+          <w:tcPr>
+            <w:tcW w:type="dxa" w:w="1728"/>
+          </w:tcPr>
+          <w:p>
+            <w:r>
+              <w:t>hybrid-search</w:t>
+            </w:r>
+          </w:p>
+        </w:tc>
+        <w:tc>
+          <w:tcPr>
+            <w:tcW w:type="dxa" w:w="1728"/>
+          </w:tcPr>
+          <w:p>
+            <w:r>
+              <w:t>标签</w:t>
+            </w:r>
+          </w:p>
+        </w:tc>
+        <w:tc>
+          <w:tcPr>
+            <w:tcW w:type="dxa" w:w="1728"/>
+          </w:tcPr>
+          <w:p>
+            <w:r/>
+          </w:p>
+        </w:tc>
+      </w:tr>
+      <w:tr>
+        <w:tc>
+          <w:tcPr>
+            <w:tcW w:type="dxa" w:w="1728"/>
+          </w:tcPr>
+          <w:p>
+            <w:r>
+              <w:t>Q-TB-01</w:t>
+            </w:r>
+          </w:p>
+        </w:tc>
+        <w:tc>
+          <w:tcPr>
+            <w:tcW w:type="dxa" w:w="1728"/>
+          </w:tcPr>
+          <w:p>
+            <w:r>
+              <w:t>Table header</w:t>
+            </w:r>
+          </w:p>
+        </w:tc>
+        <w:tc>
+          <w:tcPr>
+            <w:tcW w:type="dxa" w:w="1728"/>
+          </w:tcPr>
+          <w:p>
+            <w:r>
+              <w:t>Topic · Replies · Views · Activity</w:t>
+            </w:r>
+          </w:p>
+        </w:tc>
+        <w:tc>
+          <w:tcPr>
+            <w:tcW w:type="dxa" w:w="1728"/>
+          </w:tcPr>
+          <w:p>
+            <w:r>
+              <w:t>表头</w:t>
+            </w:r>
+          </w:p>
+        </w:tc>
+        <w:tc>
+          <w:tcPr>
+            <w:tcW w:type="dxa" w:w="1728"/>
+          </w:tcPr>
+          <w:p>
+            <w:r/>
+          </w:p>
+        </w:tc>
+      </w:tr>
+      <w:tr>
+        <w:tc>
+          <w:tcPr>
+            <w:tcW w:type="dxa" w:w="1728"/>
+          </w:tcPr>
+          <w:p>
+            <w:r>
+              <w:t>Q-03</w:t>
+            </w:r>
+          </w:p>
+        </w:tc>
+        <w:tc>
+          <w:tcPr>
+            <w:tcW w:type="dxa" w:w="1728"/>
+          </w:tcPr>
+          <w:p>
+            <w:r>
+              <w:t>H1</w:t>
+            </w:r>
+          </w:p>
+        </w:tc>
+        <w:tc>
+          <w:tcPr>
+            <w:tcW w:type="dxa" w:w="1728"/>
+          </w:tcPr>
+          <w:p>
+            <w:r>
+              <w:t>OceanBase User Group Q&amp;A</w:t>
+            </w:r>
+          </w:p>
+        </w:tc>
+        <w:tc>
+          <w:tcPr>
+            <w:tcW w:type="dxa" w:w="1728"/>
+          </w:tcPr>
+          <w:p>
+            <w:r>
+              <w:t>标题</w:t>
+            </w:r>
+          </w:p>
+        </w:tc>
+        <w:tc>
+          <w:tcPr>
+            <w:tcW w:type="dxa" w:w="1728"/>
+          </w:tcPr>
+          <w:p>
+            <w:r/>
+          </w:p>
+        </w:tc>
+      </w:tr>
+      <w:tr>
+        <w:tc>
+          <w:tcPr>
+            <w:tcW w:type="dxa" w:w="1728"/>
+          </w:tcPr>
+          <w:p>
+            <w:r>
+              <w:t>Q-TP-02</w:t>
+            </w:r>
+          </w:p>
+        </w:tc>
+        <w:tc>
+          <w:tcPr>
+            <w:tcW w:type="dxa" w:w="1728"/>
+          </w:tcPr>
+          <w:p>
+            <w:r>
+              <w:t>Topic</w:t>
+            </w:r>
+          </w:p>
+        </w:tc>
+        <w:tc>
+          <w:tcPr>
+            <w:tcW w:type="dxa" w:w="1728"/>
+          </w:tcPr>
+          <w:p>
+            <w:r>
+              <w:t>seekdb hybrid search returns empty — knn + BM25 in one SQL</w:t>
+            </w:r>
+          </w:p>
+        </w:tc>
+        <w:tc>
+          <w:tcPr>
+            <w:tcW w:type="dxa" w:w="1728"/>
+          </w:tcPr>
+          <w:p>
+            <w:r>
+              <w:t>Demo话题</w:t>
+            </w:r>
+          </w:p>
+        </w:tc>
+        <w:tc>
+          <w:tcPr>
+            <w:tcW w:type="dxa" w:w="1728"/>
+          </w:tcPr>
+          <w:p>
+            <w:r/>
+          </w:p>
+        </w:tc>
+      </w:tr>
+      <w:tr>
+        <w:tc>
+          <w:tcPr>
+            <w:tcW w:type="dxa" w:w="1728"/>
+          </w:tcPr>
+          <w:p>
+            <w:r>
+              <w:t>Q-TP-03</w:t>
+            </w:r>
+          </w:p>
+        </w:tc>
+        <w:tc>
+          <w:tcPr>
+            <w:tcW w:type="dxa" w:w="1728"/>
+          </w:tcPr>
+          <w:p>
+            <w:r>
+              <w:t>Topic</w:t>
+            </w:r>
+          </w:p>
+        </w:tc>
+        <w:tc>
+          <w:tcPr>
+            <w:tcW w:type="dxa" w:w="1728"/>
+          </w:tcPr>
+          <w:p>
+            <w:r>
+              <w:t>How to install OceanBase on Kubernetes (minimal prod checklist)?</w:t>
+            </w:r>
+          </w:p>
+        </w:tc>
+        <w:tc>
+          <w:tcPr>
+            <w:tcW w:type="dxa" w:w="1728"/>
+          </w:tcPr>
+          <w:p>
+            <w:r>
+              <w:t>Demo话题</w:t>
+            </w:r>
+          </w:p>
+        </w:tc>
+        <w:tc>
+          <w:tcPr>
+            <w:tcW w:type="dxa" w:w="1728"/>
+          </w:tcPr>
+          <w:p>
+            <w:r/>
+          </w:p>
+        </w:tc>
+      </w:tr>
+    </w:tbl>
+    <w:p/>
+    <w:p>
+      <w:pPr>
+        <w:pStyle w:val="Heading2"/>
+      </w:pPr>
+      <w:r>
+        <w:t>H. Ask OUG — Signup &amp; Topic detail</w:t>
+      </w:r>
+    </w:p>
+    <w:p>
+      <w:r>
+        <w:rPr>
+          <w:color w:val="2563EB"/>
+          <w:sz w:val="20"/>
+        </w:rPr>
+        <w:t>页面预览：https://oceandata4ai.github.io/oceandata4ai-hub/qa/ask.html</w:t>
+      </w:r>
+    </w:p>
+    <w:tbl>
+      <w:tblPr>
+        <w:tblStyle w:val="TableGrid"/>
+        <w:tblW w:type="auto" w:w="0"/>
+        <w:tblLook w:firstColumn="1" w:firstRow="1" w:lastColumn="0" w:lastRow="0" w:noHBand="0" w:noVBand="1" w:val="04A0"/>
+      </w:tblPr>
+      <w:tblGrid>
+        <w:gridCol w:w="1728"/>
+        <w:gridCol w:w="1728"/>
+        <w:gridCol w:w="1728"/>
+        <w:gridCol w:w="1728"/>
+        <w:gridCol w:w="1728"/>
+      </w:tblGrid>
+      <w:tr>
+        <w:tc>
+          <w:tcPr>
+            <w:tcW w:type="dxa" w:w="1728"/>
+          </w:tcPr>
+          <w:p>
+            <w:r>
+              <w:rPr>
+                <w:b/>
+              </w:rPr>
+              <w:t>ID</w:t>
+            </w:r>
+          </w:p>
+        </w:tc>
+        <w:tc>
+          <w:tcPr>
+            <w:tcW w:type="dxa" w:w="1728"/>
+          </w:tcPr>
+          <w:p>
+            <w:r>
+              <w:rPr>
+                <w:b/>
+              </w:rPr>
+              <w:t>位置</w:t>
+            </w:r>
+          </w:p>
+        </w:tc>
+        <w:tc>
+          <w:tcPr>
+            <w:tcW w:type="dxa" w:w="1728"/>
+          </w:tcPr>
+          <w:p>
+            <w:r>
+              <w:rPr>
+                <w:b/>
+              </w:rPr>
+              <w:t>英文原文</w:t>
+            </w:r>
+          </w:p>
+        </w:tc>
+        <w:tc>
+          <w:tcPr>
+            <w:tcW w:type="dxa" w:w="1728"/>
+          </w:tcPr>
+          <w:p>
+            <w:r>
+              <w:rPr>
+                <w:b/>
+              </w:rPr>
+              <w:t>类型</w:t>
+            </w:r>
+          </w:p>
+        </w:tc>
+        <w:tc>
+          <w:tcPr>
+            <w:tcW w:type="dxa" w:w="1728"/>
+          </w:tcPr>
+          <w:p>
+            <w:r>
+              <w:rPr>
+                <w:b/>
+              </w:rPr>
+              <w:t>评审意见（请填写）</w:t>
+            </w:r>
+          </w:p>
+        </w:tc>
+      </w:tr>
+      <w:tr>
+        <w:tc>
+          <w:tcPr>
+            <w:tcW w:type="dxa" w:w="1728"/>
+          </w:tcPr>
+          <w:p>
+            <w:r>
+              <w:t>Q-08</w:t>
+            </w:r>
+          </w:p>
+        </w:tc>
+        <w:tc>
+          <w:tcPr>
+            <w:tcW w:type="dxa" w:w="1728"/>
+          </w:tcPr>
+          <w:p>
+            <w:r>
+              <w:t>Signup</w:t>
+            </w:r>
+          </w:p>
+        </w:tc>
+        <w:tc>
+          <w:tcPr>
+            <w:tcW w:type="dxa" w:w="1728"/>
+          </w:tcPr>
+          <w:p>
+            <w:r>
+              <w:t>Sign up for Ask OUG / Sign in to Ask OUG</w:t>
+            </w:r>
+          </w:p>
+        </w:tc>
+        <w:tc>
+          <w:tcPr>
+            <w:tcW w:type="dxa" w:w="1728"/>
+          </w:tcPr>
+          <w:p>
+            <w:r>
+              <w:t>标题</w:t>
+            </w:r>
+          </w:p>
+        </w:tc>
+        <w:tc>
+          <w:tcPr>
+            <w:tcW w:type="dxa" w:w="1728"/>
+          </w:tcPr>
+          <w:p>
+            <w:r/>
+          </w:p>
+        </w:tc>
+      </w:tr>
+      <w:tr>
+        <w:tc>
+          <w:tcPr>
+            <w:tcW w:type="dxa" w:w="1728"/>
+          </w:tcPr>
+          <w:p>
+            <w:r>
+              <w:t>Q-14</w:t>
+            </w:r>
+          </w:p>
+        </w:tc>
+        <w:tc>
+          <w:tcPr>
+            <w:tcW w:type="dxa" w:w="1728"/>
+          </w:tcPr>
+          <w:p>
+            <w:r>
+              <w:t>Verify</w:t>
+            </w:r>
+          </w:p>
+        </w:tc>
+        <w:tc>
+          <w:tcPr>
+            <w:tcW w:type="dxa" w:w="1728"/>
+          </w:tcPr>
+          <w:p>
+            <w:r>
+              <w:t>Check your email — Verify email from The OceanData4AI Community</w:t>
+            </w:r>
+          </w:p>
+        </w:tc>
+        <w:tc>
+          <w:tcPr>
+            <w:tcW w:type="dxa" w:w="1728"/>
+          </w:tcPr>
+          <w:p>
+            <w:r>
+              <w:t>邮件流</w:t>
+            </w:r>
+          </w:p>
+        </w:tc>
+        <w:tc>
+          <w:tcPr>
+            <w:tcW w:type="dxa" w:w="1728"/>
+          </w:tcPr>
+          <w:p>
+            <w:r/>
+          </w:p>
+        </w:tc>
+      </w:tr>
+      <w:tr>
+        <w:tc>
+          <w:tcPr>
+            <w:tcW w:type="dxa" w:w="1728"/>
+          </w:tcPr>
+          <w:p>
+            <w:r>
+              <w:t>Q-16a</w:t>
+            </w:r>
+          </w:p>
+        </w:tc>
+        <w:tc>
+          <w:tcPr>
+            <w:tcW w:type="dxa" w:w="1728"/>
+          </w:tcPr>
+          <w:p>
+            <w:r>
+              <w:t>Placeholder</w:t>
+            </w:r>
+          </w:p>
+        </w:tc>
+        <w:tc>
+          <w:tcPr>
+            <w:tcW w:type="dxa" w:w="1728"/>
+          </w:tcPr>
+          <w:p>
+            <w:r>
+              <w:t>Summarize your question</w:t>
+            </w:r>
+          </w:p>
+        </w:tc>
+        <w:tc>
+          <w:tcPr>
+            <w:tcW w:type="dxa" w:w="1728"/>
+          </w:tcPr>
+          <w:p>
+            <w:r>
+              <w:t>占位</w:t>
+            </w:r>
+          </w:p>
+        </w:tc>
+        <w:tc>
+          <w:tcPr>
+            <w:tcW w:type="dxa" w:w="1728"/>
+          </w:tcPr>
+          <w:p>
+            <w:r/>
+          </w:p>
+        </w:tc>
+      </w:tr>
+      <w:tr>
+        <w:tc>
+          <w:tcPr>
+            <w:tcW w:type="dxa" w:w="1728"/>
+          </w:tcPr>
+          <w:p>
+            <w:r>
+              <w:t>Q-TV-05</w:t>
+            </w:r>
+          </w:p>
+        </w:tc>
+        <w:tc>
+          <w:tcPr>
+            <w:tcW w:type="dxa" w:w="1728"/>
+          </w:tcPr>
+          <w:p>
+            <w:r>
+              <w:t>Topic page</w:t>
+            </w:r>
+          </w:p>
+        </w:tc>
+        <w:tc>
+          <w:tcPr>
+            <w:tcW w:type="dxa" w:w="1728"/>
+          </w:tcPr>
+          <w:p>
+            <w:r>
+              <w:t>Posting and replies open when hosted Q&amp;A goes live…</w:t>
+            </w:r>
+          </w:p>
+        </w:tc>
+        <w:tc>
+          <w:tcPr>
+            <w:tcW w:type="dxa" w:w="1728"/>
+          </w:tcPr>
+          <w:p>
+            <w:r>
+              <w:t>说明</w:t>
+            </w:r>
+          </w:p>
+        </w:tc>
+        <w:tc>
+          <w:tcPr>
+            <w:tcW w:type="dxa" w:w="1728"/>
+          </w:tcPr>
+          <w:p>
+            <w:r/>
+          </w:p>
+        </w:tc>
+      </w:tr>
+      <w:tr>
+        <w:tc>
+          <w:tcPr>
+            <w:tcW w:type="dxa" w:w="1728"/>
+          </w:tcPr>
+          <w:p>
+            <w:r>
+              <w:t>Q-VF-02</w:t>
+            </w:r>
+          </w:p>
+        </w:tc>
+        <w:tc>
+          <w:tcPr>
+            <w:tcW w:type="dxa" w:w="1728"/>
+          </w:tcPr>
+          <w:p>
+            <w:r>
+              <w:t>Verify page</w:t>
+            </w:r>
+          </w:p>
+        </w:tc>
+        <w:tc>
+          <w:tcPr>
+            <w:tcW w:type="dxa" w:w="1728"/>
+          </w:tcPr>
+          <w:p>
+            <w:r>
+              <w:t>Email verified — Continue to Ask OUG</w:t>
+            </w:r>
+          </w:p>
+        </w:tc>
+        <w:tc>
+          <w:tcPr>
+            <w:tcW w:type="dxa" w:w="1728"/>
+          </w:tcPr>
+          <w:p>
+            <w:r>
+              <w:t>验证成功</w:t>
+            </w:r>
+          </w:p>
+        </w:tc>
+        <w:tc>
+          <w:tcPr>
+            <w:tcW w:type="dxa" w:w="1728"/>
+          </w:tcPr>
+          <w:p>
+            <w:r/>
+          </w:p>
+        </w:tc>
+      </w:tr>
+      <w:tr>
+        <w:tc>
+          <w:tcPr>
+            <w:tcW w:type="dxa" w:w="1728"/>
+          </w:tcPr>
+          <w:p>
+            <w:r>
+              <w:t>Q-VF-05</w:t>
+            </w:r>
+          </w:p>
+        </w:tc>
+        <w:tc>
+          <w:tcPr>
+            <w:tcW w:type="dxa" w:w="1728"/>
+          </w:tcPr>
+          <w:p>
+            <w:r>
+              <w:t>Verify page</w:t>
+            </w:r>
+          </w:p>
+        </w:tc>
+        <w:tc>
+          <w:tcPr>
+            <w:tcW w:type="dxa" w:w="1728"/>
+          </w:tcPr>
+          <w:p>
+            <w:r>
+              <w:t>Verification failed — Back to sign up</w:t>
+            </w:r>
+          </w:p>
+        </w:tc>
+        <w:tc>
+          <w:tcPr>
+            <w:tcW w:type="dxa" w:w="1728"/>
+          </w:tcPr>
+          <w:p>
+            <w:r>
+              <w:t>验证失败</w:t>
             </w:r>
           </w:p>
         </w:tc>

</xml_diff>